<commit_message>
docs: restructure Schemes User Manual into 3 process-step parts
Reorganize the manual (generator script + Markdown + regenerated .docx) into
the requested three parts, each driven by numbered Process Steps:
- Part 1 - Scheme Product Creation (group builder)
- Part 2 - Scheme Creation and Applicability, plus a 'Scheme Types - with an
  example each' subsection (Free Quantity, QPS, FOC Giveaway, Category Value,
  Order Value)
- Part 3 - Creation of Order (Secondary Customer order flow, grounded in the
  Beat Planner -> productScreen4 screens)
Overview kept as intro; troubleshooting + quick-reference kept as an appendix.
Regenerated docs/Schemes-User-Manual.docx via _build_schemes_docx.py.

Co-Authored-By: Claude Opus 4.8 <noreply@anthropic.com>
Claude-Session: https://claude.ai/code/session_01LibrJwGzfyvWyvb2Ni8xzU
</commit_message>
<xml_diff>
--- a/docs/Schemes-User-Manual.docx
+++ b/docs/Schemes-User-Manual.docx
@@ -26,7 +26,7 @@
           <w:color w:val="6B7280"/>
           <w:sz w:val="22"/>
         </w:rPr>
-        <w:t>This manual explains how to set up and use Schemes in the system, end to end: Scheme Product Group creation, Scheme creation, and how schemes appear and apply during Order creation. It includes worked examples and a troubleshooting checklist.</w:t>
+        <w:t>This manual explains how to set up and use Schemes in the system, end to end, as three process-step parts: Part 1 — Scheme Product Creation, Part 2 — Scheme Creation and Applicability (including the scheme types with a worked example for each), and Part 3 — Creation of Order. A short concepts overview and a troubleshooting checklist are included.</w:t>
       </w:r>
     </w:p>
     <w:p>
@@ -747,7 +747,7 @@
         <w:pStyle w:val="Heading1"/>
       </w:pPr>
       <w:r>
-        <w:t>Part A — Creating a Scheme Product Group</w:t>
+        <w:t>Part 1 — Scheme Product Creation</w:t>
       </w:r>
     </w:p>
     <w:p>
@@ -760,7 +760,7 @@
           <w:i w:val="0"/>
           <w:sz w:val="22"/>
         </w:rPr>
-        <w:t>A Scheme Product Group is the reusable bucket of SKUs that a group-based scheme (Free Quantity, QPS, FOC Giveaway) points at. Create the group first, then reference it when you build the scheme.</w:t>
+        <w:t>A Scheme Product Group is the reusable bucket of SKUs that a group-based scheme (Free Quantity, QPS, FOC Giveaway) points at. Always create the group first, then reference it when you build the scheme in Part 2.</w:t>
       </w:r>
     </w:p>
     <w:p>
@@ -768,28 +768,63 @@
         <w:pStyle w:val="Heading2"/>
       </w:pPr>
       <w:r>
-        <w:t>A.1  Open the builder</w:t>
+        <w:t>Process steps</w:t>
       </w:r>
     </w:p>
     <w:p>
       <w:pPr>
-        <w:spacing w:after="120"/>
+        <w:pStyle w:val="ListNumber"/>
       </w:pPr>
       <w:r>
-        <w:rPr>
-          <w:b w:val="0"/>
-          <w:i w:val="0"/>
-          <w:sz w:val="22"/>
-        </w:rPr>
         <w:t>Open the Scheme Product Group screen and click New (or open an existing group to edit it).</w:t>
       </w:r>
     </w:p>
     <w:p>
       <w:pPr>
+        <w:pStyle w:val="ListNumber"/>
+      </w:pPr>
+      <w:r>
+        <w:t>Fill the header — Name, Group Purpose, Sales Channel, optional Description, and the Active toggle (see the field table below).</w:t>
+      </w:r>
+    </w:p>
+    <w:p>
+      <w:pPr>
+        <w:pStyle w:val="ListNumber"/>
+      </w:pPr>
+      <w:r>
+        <w:t>Select the Sales Channel. The SKU table stays hidden ('Select a Sales Channel') until a channel is chosen, then loads the products for that channel.</w:t>
+      </w:r>
+    </w:p>
+    <w:p>
+      <w:pPr>
+        <w:pStyle w:val="ListNumber"/>
+      </w:pPr>
+      <w:r>
+        <w:t>Narrow the list with the filter row (Category, Product Group, Sub Group, Variant, Grammage, MRP) or the Search SKU box (product name / SKU code).</w:t>
+      </w:r>
+    </w:p>
+    <w:p>
+      <w:pPr>
+        <w:pStyle w:val="ListNumber"/>
+      </w:pPr>
+      <w:r>
+        <w:t>Tick the checkbox on each SKU you want in the group — the header shows a live 'n selected' count. Watch the conflict (⚠) flag.</w:t>
+      </w:r>
+    </w:p>
+    <w:p>
+      <w:pPr>
+        <w:pStyle w:val="ListNumber"/>
+      </w:pPr>
+      <w:r>
+        <w:t>Click Save. The group and its selected products (Scheme Product Group Items) are stored together and the group becomes available in the Scheme wizard.</w:t>
+      </w:r>
+    </w:p>
+    <w:p>
+      <w:pPr>
         <w:pStyle w:val="Heading2"/>
       </w:pPr>
       <w:r>
-        <w:t>A.2  Fill the header</w:t>
+        <w:t>Header fields</w:t>
       </w:r>
     </w:p>
     <w:tbl>
@@ -1081,24 +1116,42 @@
     <w:p/>
     <w:p>
       <w:pPr>
-        <w:spacing w:after="120"/>
+        <w:pStyle w:val="Heading2"/>
       </w:pPr>
       <w:r>
-        <w:rPr>
-          <w:b w:val="0"/>
-          <w:i/>
-          <w:color w:val="6B7280"/>
-          <w:sz w:val="22"/>
-        </w:rPr>
-        <w:t>Until you select a Sales Channel, the product table stays hidden with the hint 'Select a Sales Channel.'</w:t>
+        <w:t>Filter &amp; selection helpers</w:t>
       </w:r>
     </w:p>
     <w:p>
       <w:pPr>
-        <w:pStyle w:val="Heading2"/>
+        <w:pStyle w:val="ListBullet"/>
       </w:pPr>
       <w:r>
-        <w:t>A.3  Find the products</w:t>
+        <w:t>Clear Filters — reset all filters.</w:t>
+      </w:r>
+    </w:p>
+    <w:p>
+      <w:pPr>
+        <w:pStyle w:val="ListBullet"/>
+      </w:pPr>
+      <w:r>
+        <w:t>Select All Visible — tick every row currently shown by the filters.</w:t>
+      </w:r>
+    </w:p>
+    <w:p>
+      <w:pPr>
+        <w:pStyle w:val="ListBullet"/>
+      </w:pPr>
+      <w:r>
+        <w:t>Clear Selection — untick everything.</w:t>
+      </w:r>
+    </w:p>
+    <w:p>
+      <w:pPr>
+        <w:pStyle w:val="ListBullet"/>
+      </w:pPr>
+      <w:r>
+        <w:t>All / Selected (n) toggle — switch between the full list and just your picked items.</w:t>
       </w:r>
     </w:p>
     <w:p>
@@ -1111,89 +1164,7 @@
           <w:i w:val="0"/>
           <w:sz w:val="22"/>
         </w:rPr>
-        <w:t>Once a channel is selected, the SKU table loads. Narrow it down with the filter row:</w:t>
-      </w:r>
-    </w:p>
-    <w:p>
-      <w:pPr>
-        <w:pStyle w:val="ListBullet"/>
-      </w:pPr>
-      <w:r>
-        <w:t>Category, Product Group, Sub Group, Variant, Grammage (g), MRP</w:t>
-      </w:r>
-    </w:p>
-    <w:p>
-      <w:pPr>
-        <w:pStyle w:val="ListBullet"/>
-      </w:pPr>
-      <w:r>
-        <w:t>Search SKU — type a product name or SKU code.</w:t>
-      </w:r>
-    </w:p>
-    <w:p>
-      <w:pPr>
-        <w:spacing w:after="120"/>
-      </w:pPr>
-      <w:r>
-        <w:rPr>
-          <w:b w:val="0"/>
-          <w:i w:val="0"/>
-          <w:sz w:val="22"/>
-        </w:rPr>
-        <w:t>Helper buttons:</w:t>
-      </w:r>
-    </w:p>
-    <w:p>
-      <w:pPr>
-        <w:pStyle w:val="ListBullet"/>
-      </w:pPr>
-      <w:r>
-        <w:t>Clear Filters — reset all filters.</w:t>
-      </w:r>
-    </w:p>
-    <w:p>
-      <w:pPr>
-        <w:pStyle w:val="ListBullet"/>
-      </w:pPr>
-      <w:r>
-        <w:t>Select All Visible — tick every row currently shown by the filters.</w:t>
-      </w:r>
-    </w:p>
-    <w:p>
-      <w:pPr>
-        <w:pStyle w:val="ListBullet"/>
-      </w:pPr>
-      <w:r>
-        <w:t>Clear Selection — untick everything.</w:t>
-      </w:r>
-    </w:p>
-    <w:p>
-      <w:pPr>
-        <w:pStyle w:val="ListBullet"/>
-      </w:pPr>
-      <w:r>
-        <w:t>All / Selected (n) toggle — switch between the full list and just your picked items.</w:t>
-      </w:r>
-    </w:p>
-    <w:p>
-      <w:pPr>
-        <w:pStyle w:val="Heading2"/>
-      </w:pPr>
-      <w:r>
-        <w:t>A.4  Select the SKUs</w:t>
-      </w:r>
-    </w:p>
-    <w:p>
-      <w:pPr>
-        <w:spacing w:after="120"/>
-      </w:pPr>
-      <w:r>
-        <w:rPr>
-          <w:b w:val="0"/>
-          <w:i w:val="0"/>
-          <w:sz w:val="22"/>
-        </w:rPr>
-        <w:t>Tick the checkbox on each product you want in the group. The header shows a live 'n selected' count. Columns: SKU Code, Product Name, Category, Group, Sub Group, Variant, Grammage, MRP, and a warning flag.</w:t>
+        <w:t>SKU columns: SKU Code, Product Name, Category, Group, Sub Group, Variant, Grammage, MRP, and a warning flag.</w:t>
       </w:r>
     </w:p>
     <w:p>
@@ -1212,27 +1183,6 @@
     </w:p>
     <w:p>
       <w:pPr>
-        <w:pStyle w:val="Heading2"/>
-      </w:pPr>
-      <w:r>
-        <w:t>A.5  Save</w:t>
-      </w:r>
-    </w:p>
-    <w:p>
-      <w:pPr>
-        <w:spacing w:after="120"/>
-      </w:pPr>
-      <w:r>
-        <w:rPr>
-          <w:b w:val="0"/>
-          <w:i w:val="0"/>
-          <w:sz w:val="22"/>
-        </w:rPr>
-        <w:t>Click Save. The group and its selected products (Scheme Product Group Items) are stored together. The group is now available to pick in the Scheme wizard.</w:t>
-      </w:r>
-    </w:p>
-    <w:p>
-      <w:pPr>
         <w:spacing w:after="120"/>
       </w:pPr>
       <w:r>
@@ -1250,7 +1200,7 @@
         <w:pStyle w:val="Heading1"/>
       </w:pPr>
       <w:r>
-        <w:t>Part B — Creating a Scheme</w:t>
+        <w:t>Part 2 — Scheme Creation and Applicability</w:t>
       </w:r>
     </w:p>
     <w:p>
@@ -1271,6 +1221,62 @@
         <w:pStyle w:val="Heading2"/>
       </w:pPr>
       <w:r>
+        <w:t>Process steps</w:t>
+      </w:r>
+    </w:p>
+    <w:p>
+      <w:pPr>
+        <w:pStyle w:val="ListNumber"/>
+      </w:pPr>
+      <w:r>
+        <w:t>Open the Scheme tab → New to launch the wizard.</w:t>
+      </w:r>
+    </w:p>
+    <w:p>
+      <w:pPr>
+        <w:pStyle w:val="ListNumber"/>
+      </w:pPr>
+      <w:r>
+        <w:t>Step 1 — Master Details: enter the Scheme Name, Sales Channel, Scheme Type, Start/End dates, and the Active toggle.</w:t>
+      </w:r>
+    </w:p>
+    <w:p>
+      <w:pPr>
+        <w:pStyle w:val="ListNumber"/>
+      </w:pPr>
+      <w:r>
+        <w:t>Step 1 — Linkage: depending on the Scheme Type, pick a Scheme Product Group (Free Quantity / QPS / FOC Giveaway), a Product Category (Category Value), or nothing (Order Value).</w:t>
+      </w:r>
+    </w:p>
+    <w:p>
+      <w:pPr>
+        <w:pStyle w:val="ListNumber"/>
+      </w:pPr>
+      <w:r>
+        <w:t>Step 1 — Slab Definition: click Add Slab and fill the tier columns (they adapt to the Scheme Type). Add more slabs for multiple tiers; the trash icon removes a row. Click Next.</w:t>
+      </w:r>
+    </w:p>
+    <w:p>
+      <w:pPr>
+        <w:pStyle w:val="ListNumber"/>
+      </w:pPr>
+      <w:r>
+        <w:t>Step 2 — Applicability: for each level (Outlet Categories, Regions, Areas, Territories) either leave 'Apply to all' ON or turn it OFF and move specific values into Selected.</w:t>
+      </w:r>
+    </w:p>
+    <w:p>
+      <w:pPr>
+        <w:pStyle w:val="ListNumber"/>
+      </w:pPr>
+      <w:r>
+        <w:t>Click Save. The Scheme, all its Slabs, and the Applicability rows are saved together in one action. Re-open the scheme anytime to edit it.</w:t>
+      </w:r>
+    </w:p>
+    <w:p>
+      <w:pPr>
+        <w:pStyle w:val="Heading2"/>
+      </w:pPr>
+      <w:r>
         <w:t>Step 1 — Definition</w:t>
       </w:r>
     </w:p>
@@ -1292,7 +1298,7 @@
         <w:pStyle w:val="Heading3"/>
       </w:pPr>
       <w:r>
-        <w:t>B.1  Master Details</w:t>
+        <w:t>Master Details</w:t>
       </w:r>
     </w:p>
     <w:tbl>
@@ -1675,7 +1681,7 @@
         <w:pStyle w:val="Heading3"/>
       </w:pPr>
       <w:r>
-        <w:t>B.2  Product Group / Category (linkage)</w:t>
+        <w:t>Product Group / Category (linkage)</w:t>
       </w:r>
     </w:p>
     <w:p>
@@ -1734,7 +1740,7 @@
         <w:pStyle w:val="Heading3"/>
       </w:pPr>
       <w:r>
-        <w:t>B.3  Slab Definition (the tiers)</w:t>
+        <w:t>Slab Definition (the tiers)</w:t>
       </w:r>
     </w:p>
     <w:p>
@@ -2300,7 +2306,7 @@
         <w:pStyle w:val="Heading3"/>
       </w:pPr>
       <w:r>
-        <w:t>B.5  Save</w:t>
+        <w:t>Save</w:t>
       </w:r>
     </w:p>
     <w:p>
@@ -2332,10 +2338,10 @@
     </w:p>
     <w:p>
       <w:pPr>
-        <w:pStyle w:val="Heading1"/>
+        <w:pStyle w:val="Heading2"/>
       </w:pPr>
       <w:r>
-        <w:t>Part C — How Schemes Appear During Order Creation</w:t>
+        <w:t>Scheme Types — with an example each</w:t>
       </w:r>
     </w:p>
     <w:p>
@@ -2348,15 +2354,284 @@
           <w:i w:val="0"/>
           <w:sz w:val="22"/>
         </w:rPr>
-        <w:t>When a salesperson creates a Secondary Customer order, matching schemes show up automatically and prices recalculate as quantities are entered.</w:t>
+        <w:t>There are five scheme types. Each example below shows the slab you would enter and what the customer gets at order time.</w:t>
       </w:r>
     </w:p>
     <w:p>
       <w:pPr>
+        <w:pStyle w:val="Heading3"/>
+      </w:pPr>
+      <w:r>
+        <w:t>1) Free Quantity</w:t>
+      </w:r>
+    </w:p>
+    <w:p>
+      <w:pPr>
+        <w:spacing w:after="120"/>
+      </w:pPr>
+      <w:r>
+        <w:rPr>
+          <w:b w:val="0"/>
+          <w:i w:val="0"/>
+          <w:sz w:val="22"/>
+        </w:rPr>
+        <w:t>Free units of the same product group; the free units' value is spread (price diluted) across the line so the line total reflects the giveaway.</w:t>
+      </w:r>
+    </w:p>
+    <w:p>
+      <w:pPr>
+        <w:spacing w:after="120"/>
+      </w:pPr>
+      <w:r>
+        <w:rPr>
+          <w:b w:val="0"/>
+          <w:i w:val="0"/>
+          <w:sz w:val="22"/>
+        </w:rPr>
+        <w:t>Example — Group 'Pudding Cake 500 G', slab Min Qty 10, Max Qty 19, Free Qty 2. The customer orders 12 EA → qualifies for the 10–19 tier → gets 2 EA free. The unit price is diluted across the 12 units so the 2 free units cost nothing overall.</w:t>
+      </w:r>
+    </w:p>
+    <w:p>
+      <w:pPr>
+        <w:pStyle w:val="Heading3"/>
+      </w:pPr>
+      <w:r>
+        <w:t>2) QPS (Quantity Purchase Scheme)</w:t>
+      </w:r>
+    </w:p>
+    <w:p>
+      <w:pPr>
+        <w:spacing w:after="120"/>
+      </w:pPr>
+      <w:r>
+        <w:rPr>
+          <w:b w:val="0"/>
+          <w:i w:val="0"/>
+          <w:sz w:val="22"/>
+        </w:rPr>
+        <w:t>A flat ₹ per-unit discount for buying within a quantity band.</w:t>
+      </w:r>
+    </w:p>
+    <w:p>
+      <w:pPr>
+        <w:spacing w:after="120"/>
+      </w:pPr>
+      <w:r>
+        <w:rPr>
+          <w:b w:val="0"/>
+          <w:i w:val="0"/>
+          <w:sz w:val="22"/>
+        </w:rPr>
+        <w:t>Example — Group 'Pudding Cake 500 G', slab Min Qty 42, Max Qty 71, Benefit ₹1 / EA. The customer orders 50 EA at ₹20 → each unit is discounted ₹1 → pays ₹19 / EA (₹50 total saving).</w:t>
+      </w:r>
+    </w:p>
+    <w:p>
+      <w:pPr>
+        <w:pStyle w:val="Heading3"/>
+      </w:pPr>
+      <w:r>
+        <w:t>3) FOC Giveaway</w:t>
+      </w:r>
+    </w:p>
+    <w:p>
+      <w:pPr>
+        <w:spacing w:after="120"/>
+      </w:pPr>
+      <w:r>
+        <w:rPr>
+          <w:b w:val="0"/>
+          <w:i w:val="0"/>
+          <w:sz w:val="22"/>
+        </w:rPr>
+        <w:t>Free units of a different (free-of-cost) product when the 'buy' group reaches the band.</w:t>
+      </w:r>
+    </w:p>
+    <w:p>
+      <w:pPr>
+        <w:spacing w:after="120"/>
+      </w:pPr>
+      <w:r>
+        <w:rPr>
+          <w:b w:val="0"/>
+          <w:i w:val="0"/>
+          <w:sz w:val="22"/>
+        </w:rPr>
+        <w:t>Example — Buy group 'Whole Wheat Chakki Atta', slab Min Qty 20, FOC Product 'Roasted Vermicelli 200 g', Free Qty 2. The customer buys 20 EA of Atta → gets 2 EA of Roasted Vermicelli free. If Vermicelli is also ordered, the 2 free units merge into that line (shown as '+2 free'); otherwise a separate FREE line is added at ₹0.</w:t>
+      </w:r>
+    </w:p>
+    <w:p>
+      <w:pPr>
+        <w:pStyle w:val="Heading3"/>
+      </w:pPr>
+      <w:r>
+        <w:t>4) Category Value</w:t>
+      </w:r>
+    </w:p>
+    <w:p>
+      <w:pPr>
+        <w:spacing w:after="120"/>
+      </w:pPr>
+      <w:r>
+        <w:rPr>
+          <w:b w:val="0"/>
+          <w:i w:val="0"/>
+          <w:sz w:val="22"/>
+        </w:rPr>
+        <w:t>A % discount on the value of a product sub-group / category, shown as a header discount.</w:t>
+      </w:r>
+    </w:p>
+    <w:p>
+      <w:pPr>
+        <w:spacing w:after="120"/>
+      </w:pPr>
+      <w:r>
+        <w:rPr>
+          <w:b w:val="0"/>
+          <w:i w:val="0"/>
+          <w:sz w:val="22"/>
+        </w:rPr>
+        <w:t>Example — Category 'Plum', slab Min Value ₹10,000, Max Value ₹19,000, Discount 1%. The customer's Plum-category lines total ₹12,000 → qualifies → 1% (₹120) is taken off as a 'Category Value Discount' on the order.</w:t>
+      </w:r>
+    </w:p>
+    <w:p>
+      <w:pPr>
+        <w:pStyle w:val="Heading3"/>
+      </w:pPr>
+      <w:r>
+        <w:t>5) Order Value</w:t>
+      </w:r>
+    </w:p>
+    <w:p>
+      <w:pPr>
+        <w:spacing w:after="120"/>
+      </w:pPr>
+      <w:r>
+        <w:rPr>
+          <w:b w:val="0"/>
+          <w:i w:val="0"/>
+          <w:sz w:val="22"/>
+        </w:rPr>
+        <w:t>A % discount on the whole order value (no product linkage), shown as a header discount and reflected in Net Payable.</w:t>
+      </w:r>
+    </w:p>
+    <w:p>
+      <w:pPr>
+        <w:spacing w:after="120"/>
+      </w:pPr>
+      <w:r>
+        <w:rPr>
+          <w:b w:val="0"/>
+          <w:i w:val="0"/>
+          <w:sz w:val="22"/>
+        </w:rPr>
+        <w:t>Example — slab Min Value ₹10,000, Max Value ₹19,000, Discount 1%. The order totals ₹15,000 → 1% off the order. Order Value is applied after any Category Value discount (i.e. on the value remaining after the category discount).</w:t>
+      </w:r>
+    </w:p>
+    <w:p>
+      <w:pPr>
+        <w:pStyle w:val="Heading1"/>
+      </w:pPr>
+      <w:r>
+        <w:t>Part 3 — Creation of Order</w:t>
+      </w:r>
+    </w:p>
+    <w:p>
+      <w:pPr>
+        <w:spacing w:after="120"/>
+      </w:pPr>
+      <w:r>
+        <w:rPr>
+          <w:b w:val="0"/>
+          <w:i w:val="0"/>
+          <w:sz w:val="22"/>
+        </w:rPr>
+        <w:t>When a salesperson creates a Secondary Customer order, matching schemes show up automatically and prices recalculate as quantities are entered. Schemes apply only for Secondary Customers — Primary Customers see base prices and a 'No schemes are applicable' message.</w:t>
+      </w:r>
+    </w:p>
+    <w:p>
+      <w:pPr>
         <w:pStyle w:val="Heading2"/>
       </w:pPr>
       <w:r>
-        <w:t>C.1  Which schemes appear (coverage rules)</w:t>
+        <w:t>Process steps</w:t>
+      </w:r>
+    </w:p>
+    <w:p>
+      <w:pPr>
+        <w:pStyle w:val="ListNumber"/>
+      </w:pPr>
+      <w:r>
+        <w:t>From the Beat Planner visit / Execute screen (or the Order object's New action), open the order screen for a Secondary Customer. The customer (account) is carried into the screen; if none is passed, use the Search Customer picker.</w:t>
+      </w:r>
+    </w:p>
+    <w:p>
+      <w:pPr>
+        <w:pStyle w:val="ListNumber"/>
+      </w:pPr>
+      <w:r>
+        <w:t>Products screen ('All items'): search / filter products and enter the EA quantity for each. A ⭐ / ribbon marks scheme products; an applied line shows a discounted price band next to the original price, with a breakup you can expand.</w:t>
+      </w:r>
+    </w:p>
+    <w:p>
+      <w:pPr>
+        <w:pStyle w:val="ListNumber"/>
+      </w:pPr>
+      <w:r>
+        <w:t>Schemes ('Running Schemes') tab: review the applicable schemes (read-only) — each card shows the name, type, offer tiers as sentences, validity, and the covered group/category. Expand / collapse with the chevron.</w:t>
+      </w:r>
+    </w:p>
+    <w:p>
+      <w:pPr>
+        <w:pStyle w:val="ListNumber"/>
+      </w:pPr>
+      <w:r>
+        <w:t>Selected tab: quick-review every product that has a non-zero quantity before finishing.</w:t>
+      </w:r>
+    </w:p>
+    <w:p>
+      <w:pPr>
+        <w:pStyle w:val="ListNumber"/>
+      </w:pPr>
+      <w:r>
+        <w:t>Summary screen: enter Delivery To and Expected Delivery Date (PO Number / PO Date appear for Primary Customers only). Review per-line discounted prices, Sub Total, Tax, Grand Total, any header discounts (Category Value / Order Value) and the resulting Net Payable. FOC / free lines are tagged FREE (or '+n free' when merged).</w:t>
+      </w:r>
+    </w:p>
+    <w:p>
+      <w:pPr>
+        <w:pStyle w:val="ListNumber"/>
+      </w:pPr>
+      <w:r>
+        <w:t>Click Save Orders. The system validates the required header fields and the minimum order value, captures the device location (GPS), then saves the order.</w:t>
+      </w:r>
+    </w:p>
+    <w:p>
+      <w:pPr>
+        <w:pStyle w:val="ListNumber"/>
+      </w:pPr>
+      <w:r>
+        <w:t>After save: a 'Orders saved successfully' toast appears and you return to the visit / Execute screen (or the Order list view if you came from the Order New action).</w:t>
+      </w:r>
+    </w:p>
+    <w:p>
+      <w:pPr>
+        <w:spacing w:after="120"/>
+      </w:pPr>
+      <w:r>
+        <w:rPr>
+          <w:b w:val="0"/>
+          <w:i/>
+          <w:color w:val="6B7280"/>
+          <w:sz w:val="22"/>
+        </w:rPr>
+        <w:t>Every applied benefit is also recorded against the order for auditing / claims (Order Scheme Applied rows: which scheme, which tier, the benefit amount, free quantity, etc.).</w:t>
+      </w:r>
+    </w:p>
+    <w:p>
+      <w:pPr>
+        <w:pStyle w:val="Heading2"/>
+      </w:pPr>
+      <w:r>
+        <w:t>Which schemes appear (coverage rules)</w:t>
       </w:r>
     </w:p>
     <w:p>
@@ -2425,7 +2700,7 @@
         <w:pStyle w:val="Heading2"/>
       </w:pPr>
       <w:r>
-        <w:t>C.2  The 'Running Schemes' list</w:t>
+        <w:t>The 'Running Schemes' list</w:t>
       </w:r>
     </w:p>
     <w:p>
@@ -2500,7 +2775,7 @@
         <w:pStyle w:val="Heading2"/>
       </w:pPr>
       <w:r>
-        <w:t>C.3  Indicators on each product row</w:t>
+        <w:t>Indicators on each product row</w:t>
       </w:r>
     </w:p>
     <w:p>
@@ -2524,7 +2799,7 @@
         <w:pStyle w:val="Heading2"/>
       </w:pPr>
       <w:r>
-        <w:t>C.4  What each scheme type does to the price</w:t>
+        <w:t>What each scheme type does to the price</w:t>
       </w:r>
     </w:p>
     <w:p>
@@ -2598,7 +2873,7 @@
         <w:pStyle w:val="Heading2"/>
       </w:pPr>
       <w:r>
-        <w:t>C.5  The order summary</w:t>
+        <w:t>The order summary</w:t>
       </w:r>
     </w:p>
     <w:p>
@@ -2643,7 +2918,7 @@
         <w:pStyle w:val="Heading1"/>
       </w:pPr>
       <w:r>
-        <w:t>Part D — Troubleshooting: 'Why isn't my scheme showing?'</w:t>
+        <w:t>Appendix — Troubleshooting: 'Why isn't my scheme showing?'</w:t>
       </w:r>
     </w:p>
     <w:p>

</xml_diff>